<commit_message>
docs(backlog): add E20 v2.4 reservation-model stories (CAP-020..024/PLC-011/OPS-006)
</commit_message>
<xml_diff>
--- a/docs/backlog/acrme_epics_stories_tasks.docx
+++ b/docs/backlog/acrme_epics_stories_tasks.docx
@@ -2,7 +2,7 @@
 <file path=word/document.xml><?xml version="1.0" encoding="utf-8"?>
 <w:document xmlns:w="http://schemas.openxmlformats.org/wordprocessingml/2006/main" xmlns:m="http://schemas.openxmlformats.org/officeDocument/2006/math" xmlns:r="http://schemas.openxmlformats.org/officeDocument/2006/relationships" xmlns:o="urn:schemas-microsoft-com:office:office" xmlns:v="urn:schemas-microsoft-com:vml" xmlns:w10="urn:schemas-microsoft-com:office:word" xmlns:a="http://schemas.openxmlformats.org/drawingml/2006/main" xmlns:pic="http://schemas.openxmlformats.org/drawingml/2006/picture" xmlns:wp="http://schemas.openxmlformats.org/drawingml/2006/wordprocessingDrawing">
   <w:body>
-    <w:bookmarkStart w:id="112" w:name="acrme-epic-story-task-backlog"/>
+    <w:bookmarkStart w:id="119" w:name="acrme-epic-story-task-backlog"/>
     <w:p>
       <w:pPr>
         <w:pStyle w:val="Heading1"/>
@@ -30,7 +30,7 @@
           <w:iCs/>
           <w:i/>
         </w:rPr>
-        <w:t xml:space="preserve">Generated 2026-08-22 from the Production-Readiness Review &amp; Final Architecture (PRR).</w:t>
+        <w:t xml:space="preserve">Generated 2026-09-07 from the Production-Readiness Review &amp; Final Architecture (PRR).</w:t>
       </w:r>
     </w:p>
     <w:p>
@@ -141,7 +141,7 @@
               <w:jc w:val="left"/>
             </w:pPr>
             <w:r>
-              <w:t xml:space="preserve">19</w:t>
+              <w:t xml:space="preserve">20</w:t>
             </w:r>
           </w:p>
         </w:tc>
@@ -167,7 +167,7 @@
               <w:jc w:val="left"/>
             </w:pPr>
             <w:r>
-              <w:t xml:space="preserve">66</w:t>
+              <w:t xml:space="preserve">72</w:t>
             </w:r>
           </w:p>
         </w:tc>
@@ -193,7 +193,7 @@
               <w:jc w:val="left"/>
             </w:pPr>
             <w:r>
-              <w:t xml:space="preserve">175</w:t>
+              <w:t xml:space="preserve">193</w:t>
             </w:r>
           </w:p>
         </w:tc>
@@ -219,7 +219,7 @@
               <w:jc w:val="left"/>
             </w:pPr>
             <w:r>
-              <w:t xml:space="preserve">426</w:t>
+              <w:t xml:space="preserve">457</w:t>
             </w:r>
           </w:p>
         </w:tc>
@@ -332,19 +332,19 @@
               <w:jc w:val="left"/>
             </w:pPr>
             <w:r>
-              <w:t xml:space="preserve">55</w:t>
-            </w:r>
-          </w:p>
-        </w:tc>
-        <w:tc>
-          <w:tcPr/>
-          <w:p>
-            <w:pPr>
-              <w:pStyle w:val="Compact"/>
-              <w:jc w:val="left"/>
-            </w:pPr>
-            <w:r>
-              <w:t xml:space="preserve">350</w:t>
+              <w:t xml:space="preserve">59</w:t>
+            </w:r>
+          </w:p>
+        </w:tc>
+        <w:tc>
+          <w:tcPr/>
+          <w:p>
+            <w:pPr>
+              <w:pStyle w:val="Compact"/>
+              <w:jc w:val="left"/>
+            </w:pPr>
+            <w:r>
+              <w:t xml:space="preserve">371</w:t>
             </w:r>
           </w:p>
         </w:tc>
@@ -382,19 +382,19 @@
               <w:jc w:val="left"/>
             </w:pPr>
             <w:r>
-              <w:t xml:space="preserve">11</w:t>
-            </w:r>
-          </w:p>
-        </w:tc>
-        <w:tc>
-          <w:tcPr/>
-          <w:p>
-            <w:pPr>
-              <w:pStyle w:val="Compact"/>
-              <w:jc w:val="left"/>
-            </w:pPr>
-            <w:r>
-              <w:t xml:space="preserve">76</w:t>
+              <w:t xml:space="preserve">13</w:t>
+            </w:r>
+          </w:p>
+        </w:tc>
+        <w:tc>
+          <w:tcPr/>
+          <w:p>
+            <w:pPr>
+              <w:pStyle w:val="Compact"/>
+              <w:jc w:val="left"/>
+            </w:pPr>
+            <w:r>
+              <w:t xml:space="preserve">86</w:t>
             </w:r>
           </w:p>
         </w:tc>
@@ -1604,9 +1604,59 @@
           </w:p>
         </w:tc>
       </w:tr>
+      <w:tr>
+        <w:tc>
+          <w:tcPr/>
+          <w:p>
+            <w:pPr>
+              <w:pStyle w:val="Compact"/>
+              <w:jc w:val="left"/>
+            </w:pPr>
+            <w:r>
+              <w:t xml:space="preserve">ACRME-E20</w:t>
+            </w:r>
+          </w:p>
+        </w:tc>
+        <w:tc>
+          <w:tcPr/>
+          <w:p>
+            <w:pPr>
+              <w:pStyle w:val="Compact"/>
+              <w:jc w:val="left"/>
+            </w:pPr>
+            <w:r>
+              <w:t xml:space="preserve">v2.4 Reservation-Model Reconciliation</w:t>
+            </w:r>
+          </w:p>
+        </w:tc>
+        <w:tc>
+          <w:tcPr/>
+          <w:p>
+            <w:pPr>
+              <w:pStyle w:val="Compact"/>
+              <w:jc w:val="left"/>
+            </w:pPr>
+            <w:r>
+              <w:t xml:space="preserve">6</w:t>
+            </w:r>
+          </w:p>
+        </w:tc>
+        <w:tc>
+          <w:tcPr/>
+          <w:p>
+            <w:pPr>
+              <w:pStyle w:val="Compact"/>
+              <w:jc w:val="left"/>
+            </w:pPr>
+            <w:r>
+              <w:t xml:space="preserve">31</w:t>
+            </w:r>
+          </w:p>
+        </w:tc>
+      </w:tr>
     </w:tbl>
     <w:bookmarkEnd w:id="25"/>
-    <w:bookmarkStart w:id="111" w:name="epics-stories-tasks"/>
+    <w:bookmarkStart w:id="118" w:name="epics-stories-tasks"/>
     <w:p>
       <w:pPr>
         <w:pStyle w:val="Heading2"/>
@@ -11228,7 +11278,7 @@
               <w:jc w:val="left"/>
             </w:pPr>
             <w:r>
-              <w:t xml:space="preserve">Middle East cross-geo extension (Saudi Arabia/UAE North → Belgium Central)</w:t>
+              <w:t xml:space="preserve">Middle East two-region placement (DR_NOT_OFFERED; Switzerland North cross-geo path pre-configured but inactive)</w:t>
             </w:r>
           </w:p>
         </w:tc>
@@ -12910,13 +12960,13 @@
       </w:r>
     </w:p>
     <w:bookmarkEnd w:id="58"/>
-    <w:bookmarkStart w:id="59" w:name="X0679ee21e30c8d1e0267482cafa578da428efd1"/>
+    <w:bookmarkStart w:id="59" w:name="Xb841676f1f4b5f69c37e2d96e3425160dd74172"/>
     <w:p>
       <w:pPr>
         <w:pStyle w:val="Heading4"/>
       </w:pPr>
       <w:r>
-        <w:t xml:space="preserve">ACRME-S0706 — Middle East cross-geo extension (Saudi Arabia/UAE North → Belgium Central)</w:t>
+        <w:t xml:space="preserve">ACRME-S0706 — Middle East two-region placement (DR_NOT_OFFERED; Switzerland North cross-geo path pre-configured but inactive)</w:t>
       </w:r>
     </w:p>
     <w:p>
@@ -12950,7 +13000,7 @@
         <w:t xml:space="preserve"> </w:t>
       </w:r>
       <w:r>
-        <w:t xml:space="preserve">Middle East DR to use the approved Belgium Central extension path,</w:t>
+        <w:t xml:space="preserve">Middle East to place Prod + CVAL across its two in-geo regions with DR set to NOT_OFFERED, and the Switzerland North cross-geo path pre-configured but inactive until DEC-001 clears,</w:t>
       </w:r>
       <w:r>
         <w:t xml:space="preserve"> </w:t>
@@ -12966,7 +13016,7 @@
         <w:t xml:space="preserve"> </w:t>
       </w:r>
       <w:r>
-        <w:t xml:space="preserve">the three-region minimum is met where only two in-geo regions exist.</w:t>
+        <w:t xml:space="preserve">Middle East deployments comply with the current DR_NOT_OFFERED legal position (DEC-001) while a compliant DR path is ready to enable by config if approved.</w:t>
       </w:r>
     </w:p>
     <w:p>
@@ -13042,7 +13092,7 @@
         <w:t xml:space="preserve"> </w:t>
       </w:r>
       <w:r>
-        <w:t xml:space="preserve">§27 Middle East, HC-10, R-12</w:t>
+        <w:t xml:space="preserve">§27 Middle East, HC-10, R-12, DR-014, DEC-001, PLC-010a</w:t>
       </w:r>
     </w:p>
     <w:p>
@@ -13088,7 +13138,7 @@
         <w:pStyle w:val="Compact"/>
       </w:pPr>
       <w:r>
-        <w:t xml:space="preserve">Prod = argmax(PS_Prod) over Saudi Arabia/UAE North; CVAL = the other in-geo region.</w:t>
+        <w:t xml:space="preserve">Prod = argmax(PS_Prod) over UAE North/Saudi Arabia Central; CVAL = the other in-geo region.</w:t>
       </w:r>
     </w:p>
     <w:p>
@@ -13100,7 +13150,7 @@
         <w:pStyle w:val="Compact"/>
       </w:pPr>
       <w:r>
-        <w:t xml:space="preserve">DR = Belgium Central via the only approved extension path; validated against HC-1..HC-10 incl. DR floor.</w:t>
+        <w:t xml:space="preserve">DR = NOT_OFFERED by default (DR-014, DEC-001): no SourceDestinationDRIndex entry, no DR earmark, no cross-geo activation.</w:t>
       </w:r>
     </w:p>
     <w:p>
@@ -13112,7 +13162,31 @@
         <w:pStyle w:val="Compact"/>
       </w:pPr>
       <w:r>
-        <w:t xml:space="preserve">If Belgium Central fails, placement is blocked with an ops alert (no silent substitution).</w:t>
+        <w:t xml:space="preserve">Switzerland North cross-geo extension is pre-configured but inactive; it activates only via config flip (dr_not_offered[</w:t>
+      </w:r>
+      <w:r>
+        <w:t xml:space="preserve">‘</w:t>
+      </w:r>
+      <w:r>
+        <w:t xml:space="preserve">Middle East</w:t>
+      </w:r>
+      <w:r>
+        <w:t xml:space="preserve">’</w:t>
+      </w:r>
+      <w:r>
+        <w:t xml:space="preserve">] = false) after DEC-001, with no code change, and is then validated against HC-1..HC-10 incl. DR floor.</w:t>
+      </w:r>
+    </w:p>
+    <w:p>
+      <w:pPr>
+        <w:numPr>
+          <w:ilvl w:val="0"/>
+          <w:numId w:val="1084"/>
+        </w:numPr>
+        <w:pStyle w:val="Compact"/>
+      </w:pPr>
+      <w:r>
+        <w:t xml:space="preserve">The engine never silently substitutes another region; DR_NOT_OFFERED is evaluated before any cross-geo extension.</w:t>
       </w:r>
     </w:p>
     <w:p>
@@ -13151,7 +13225,7 @@
         <w:t xml:space="preserve"> </w:t>
       </w:r>
       <w:r>
-        <w:t xml:space="preserve">Implement Middle East Prod/CVAL in-geo assignment</w:t>
+        <w:t xml:space="preserve">Implement Middle East Prod/CVAL in-geo assignment (two-region)</w:t>
       </w:r>
     </w:p>
     <w:p>
@@ -13178,7 +13252,7 @@
         <w:t xml:space="preserve"> </w:t>
       </w:r>
       <w:r>
-        <w:t xml:space="preserve">Implement Belgium Central cross-geo DR with HC validation</w:t>
+        <w:t xml:space="preserve">Implement DR_NOT_OFFERED handling + pre-configured (inactive) Switzerland North cross-geo path gated on DEC-001</w:t>
       </w:r>
     </w:p>
     <w:p>
@@ -13205,7 +13279,7 @@
         <w:t xml:space="preserve"> </w:t>
       </w:r>
       <w:r>
-        <w:t xml:space="preserve">Block + alert on degraded extension path (no substitution)</w:t>
+        <w:t xml:space="preserve">Block + alert on degraded extension path when active (no substitution)</w:t>
       </w:r>
     </w:p>
     <w:bookmarkEnd w:id="59"/>
@@ -28442,8 +28516,2607 @@
     </w:p>
     <w:bookmarkEnd w:id="109"/>
     <w:bookmarkEnd w:id="110"/>
+    <w:bookmarkStart w:id="117" w:name="Xe4e3f7552ac9c1b14e127e839007141db09a4e9"/>
+    <w:p>
+      <w:pPr>
+        <w:pStyle w:val="Heading3"/>
+      </w:pPr>
+      <w:r>
+        <w:t xml:space="preserve">ACRME-E20 — v2.4 Reservation-Model Reconciliation</w:t>
+      </w:r>
+    </w:p>
+    <w:p>
+      <w:pPr>
+        <w:pStyle w:val="FirstParagraph"/>
+      </w:pPr>
+      <w:r>
+        <w:rPr>
+          <w:bCs/>
+          <w:b/>
+        </w:rPr>
+        <w:t xml:space="preserve">Goal.</w:t>
+      </w:r>
+      <w:r>
+        <w:t xml:space="preserve"> </w:t>
+      </w:r>
+      <w:r>
+        <w:t xml:space="preserve">Deliver the reservation-model requirements folded into Requirements Baseline v2.4 from the reviewed architecture diagrams: reservation eligibility gates (CAP-020/CAP-021), the seed-at-0 SKU/AZ matrix and product-team budget governance (CAP-022), the explicit regional + per-AZ CRG structure (CAP-023), reactive SKU/AZ discovery (CAP-024), even zone-distribution + rebalancing (PLC-011), and the deterministic naming convention (OPS-006/C-12).</w:t>
+      </w:r>
+    </w:p>
+    <w:p>
+      <w:pPr>
+        <w:pStyle w:val="BodyText"/>
+      </w:pPr>
+      <w:r>
+        <w:rPr>
+          <w:bCs/>
+          <w:b/>
+        </w:rPr>
+        <w:t xml:space="preserve">PRR references.</w:t>
+      </w:r>
+      <w:r>
+        <w:t xml:space="preserve"> </w:t>
+      </w:r>
+      <w:r>
+        <w:t xml:space="preserve">Baseline v2.4 §2.4 changelog, CAP-020..024, PLC-011, OPS-006, C-12/C-13, Appendix A.9</w:t>
+      </w:r>
+      <w:r>
+        <w:br/>
+      </w:r>
+      <w:r>
+        <w:rPr>
+          <w:bCs/>
+          <w:b/>
+        </w:rPr>
+        <w:t xml:space="preserve">Rollup.</w:t>
+      </w:r>
+      <w:r>
+        <w:t xml:space="preserve"> </w:t>
+      </w:r>
+      <w:r>
+        <w:t xml:space="preserve">6 stories · 31 points</w:t>
+      </w:r>
+    </w:p>
+    <w:tbl>
+      <w:tblPr>
+        <w:tblStyle w:val="Table"/>
+        <w:tblW w:type="pct" w:w="5000"/>
+        <w:tblLook w:firstRow="1" w:lastRow="0" w:firstColumn="0" w:lastColumn="0" w:noHBand="0" w:noVBand="0" w:val="0020"/>
+      </w:tblPr>
+      <w:tblGrid>
+        <w:gridCol w:w="1320"/>
+        <w:gridCol w:w="1320"/>
+        <w:gridCol w:w="1320"/>
+        <w:gridCol w:w="1320"/>
+        <w:gridCol w:w="1320"/>
+        <w:gridCol w:w="1320"/>
+      </w:tblGrid>
+      <w:tr>
+        <w:trPr>
+          <w:tblHeader w:val="true"/>
+        </w:trPr>
+        <w:tc>
+          <w:tcPr/>
+          <w:p>
+            <w:pPr>
+              <w:pStyle w:val="Compact"/>
+              <w:jc w:val="left"/>
+            </w:pPr>
+            <w:r>
+              <w:t xml:space="preserve">Story</w:t>
+            </w:r>
+          </w:p>
+        </w:tc>
+        <w:tc>
+          <w:tcPr/>
+          <w:p>
+            <w:pPr>
+              <w:pStyle w:val="Compact"/>
+              <w:jc w:val="left"/>
+            </w:pPr>
+            <w:r>
+              <w:t xml:space="preserve">Title</w:t>
+            </w:r>
+          </w:p>
+        </w:tc>
+        <w:tc>
+          <w:tcPr/>
+          <w:p>
+            <w:pPr>
+              <w:pStyle w:val="Compact"/>
+              <w:jc w:val="left"/>
+            </w:pPr>
+            <w:r>
+              <w:t xml:space="preserve">Priority</w:t>
+            </w:r>
+          </w:p>
+        </w:tc>
+        <w:tc>
+          <w:tcPr/>
+          <w:p>
+            <w:pPr>
+              <w:pStyle w:val="Compact"/>
+              <w:jc w:val="left"/>
+            </w:pPr>
+            <w:r>
+              <w:t xml:space="preserve">Points</w:t>
+            </w:r>
+          </w:p>
+        </w:tc>
+        <w:tc>
+          <w:tcPr/>
+          <w:p>
+            <w:pPr>
+              <w:pStyle w:val="Compact"/>
+              <w:jc w:val="left"/>
+            </w:pPr>
+            <w:r>
+              <w:t xml:space="preserve">Phase</w:t>
+            </w:r>
+          </w:p>
+        </w:tc>
+        <w:tc>
+          <w:tcPr/>
+          <w:p>
+            <w:pPr>
+              <w:pStyle w:val="Compact"/>
+              <w:jc w:val="left"/>
+            </w:pPr>
+            <w:r>
+              <w:t xml:space="preserve">Depends on</w:t>
+            </w:r>
+          </w:p>
+        </w:tc>
+      </w:tr>
+      <w:tr>
+        <w:tc>
+          <w:tcPr/>
+          <w:p>
+            <w:pPr>
+              <w:pStyle w:val="Compact"/>
+              <w:jc w:val="left"/>
+            </w:pPr>
+            <w:r>
+              <w:t xml:space="preserve">ACRME-S2001</w:t>
+            </w:r>
+          </w:p>
+        </w:tc>
+        <w:tc>
+          <w:tcPr/>
+          <w:p>
+            <w:pPr>
+              <w:pStyle w:val="Compact"/>
+              <w:jc w:val="left"/>
+            </w:pPr>
+            <w:r>
+              <w:t xml:space="preserve">Reservation eligibility gate — Availability-Set ineligibility &amp; AZ onboarding precondition</w:t>
+            </w:r>
+          </w:p>
+        </w:tc>
+        <w:tc>
+          <w:tcPr/>
+          <w:p>
+            <w:pPr>
+              <w:pStyle w:val="Compact"/>
+              <w:jc w:val="left"/>
+            </w:pPr>
+            <w:r>
+              <w:t xml:space="preserve">Highest</w:t>
+            </w:r>
+          </w:p>
+        </w:tc>
+        <w:tc>
+          <w:tcPr/>
+          <w:p>
+            <w:pPr>
+              <w:pStyle w:val="Compact"/>
+              <w:jc w:val="left"/>
+            </w:pPr>
+            <w:r>
+              <w:t xml:space="preserve">5</w:t>
+            </w:r>
+          </w:p>
+        </w:tc>
+        <w:tc>
+          <w:tcPr/>
+          <w:p>
+            <w:pPr>
+              <w:pStyle w:val="Compact"/>
+              <w:jc w:val="left"/>
+            </w:pPr>
+            <w:r>
+              <w:t xml:space="preserve">P1</w:t>
+            </w:r>
+          </w:p>
+        </w:tc>
+        <w:tc>
+          <w:tcPr/>
+          <w:p>
+            <w:pPr>
+              <w:pStyle w:val="Compact"/>
+              <w:jc w:val="left"/>
+            </w:pPr>
+            <w:r>
+              <w:t xml:space="preserve">ACRME-S0201</w:t>
+            </w:r>
+          </w:p>
+        </w:tc>
+      </w:tr>
+      <w:tr>
+        <w:tc>
+          <w:tcPr/>
+          <w:p>
+            <w:pPr>
+              <w:pStyle w:val="Compact"/>
+              <w:jc w:val="left"/>
+            </w:pPr>
+            <w:r>
+              <w:t xml:space="preserve">ACRME-S2002</w:t>
+            </w:r>
+          </w:p>
+        </w:tc>
+        <w:tc>
+          <w:tcPr/>
+          <w:p>
+            <w:pPr>
+              <w:pStyle w:val="Compact"/>
+              <w:jc w:val="left"/>
+            </w:pPr>
+            <w:r>
+              <w:t xml:space="preserve">Seed-at-0 SKU/AZ matrix and product-team budget governance</w:t>
+            </w:r>
+          </w:p>
+        </w:tc>
+        <w:tc>
+          <w:tcPr/>
+          <w:p>
+            <w:pPr>
+              <w:pStyle w:val="Compact"/>
+              <w:jc w:val="left"/>
+            </w:pPr>
+            <w:r>
+              <w:t xml:space="preserve">Highest</w:t>
+            </w:r>
+          </w:p>
+        </w:tc>
+        <w:tc>
+          <w:tcPr/>
+          <w:p>
+            <w:pPr>
+              <w:pStyle w:val="Compact"/>
+              <w:jc w:val="left"/>
+            </w:pPr>
+            <w:r>
+              <w:t xml:space="preserve">8</w:t>
+            </w:r>
+          </w:p>
+        </w:tc>
+        <w:tc>
+          <w:tcPr/>
+          <w:p>
+            <w:pPr>
+              <w:pStyle w:val="Compact"/>
+              <w:jc w:val="left"/>
+            </w:pPr>
+            <w:r>
+              <w:t xml:space="preserve">P1</w:t>
+            </w:r>
+          </w:p>
+        </w:tc>
+        <w:tc>
+          <w:tcPr/>
+          <w:p>
+            <w:pPr>
+              <w:pStyle w:val="Compact"/>
+              <w:jc w:val="left"/>
+            </w:pPr>
+            <w:r>
+              <w:t xml:space="preserve">ACRME-S0301</w:t>
+            </w:r>
+          </w:p>
+        </w:tc>
+      </w:tr>
+      <w:tr>
+        <w:tc>
+          <w:tcPr/>
+          <w:p>
+            <w:pPr>
+              <w:pStyle w:val="Compact"/>
+              <w:jc w:val="left"/>
+            </w:pPr>
+            <w:r>
+              <w:t xml:space="preserve">ACRME-S2003</w:t>
+            </w:r>
+          </w:p>
+        </w:tc>
+        <w:tc>
+          <w:tcPr/>
+          <w:p>
+            <w:pPr>
+              <w:pStyle w:val="Compact"/>
+              <w:jc w:val="left"/>
+            </w:pPr>
+            <w:r>
+              <w:t xml:space="preserve">Explicit regional + per-AZ CRG structure per environment</w:t>
+            </w:r>
+          </w:p>
+        </w:tc>
+        <w:tc>
+          <w:tcPr/>
+          <w:p>
+            <w:pPr>
+              <w:pStyle w:val="Compact"/>
+              <w:jc w:val="left"/>
+            </w:pPr>
+            <w:r>
+              <w:t xml:space="preserve">High</w:t>
+            </w:r>
+          </w:p>
+        </w:tc>
+        <w:tc>
+          <w:tcPr/>
+          <w:p>
+            <w:pPr>
+              <w:pStyle w:val="Compact"/>
+              <w:jc w:val="left"/>
+            </w:pPr>
+            <w:r>
+              <w:t xml:space="preserve">5</w:t>
+            </w:r>
+          </w:p>
+        </w:tc>
+        <w:tc>
+          <w:tcPr/>
+          <w:p>
+            <w:pPr>
+              <w:pStyle w:val="Compact"/>
+              <w:jc w:val="left"/>
+            </w:pPr>
+            <w:r>
+              <w:t xml:space="preserve">P1</w:t>
+            </w:r>
+          </w:p>
+        </w:tc>
+        <w:tc>
+          <w:tcPr/>
+          <w:p>
+            <w:pPr>
+              <w:pStyle w:val="Compact"/>
+              <w:jc w:val="left"/>
+            </w:pPr>
+            <w:r>
+              <w:t xml:space="preserve">ACRME-S0301</w:t>
+            </w:r>
+          </w:p>
+        </w:tc>
+      </w:tr>
+      <w:tr>
+        <w:tc>
+          <w:tcPr/>
+          <w:p>
+            <w:pPr>
+              <w:pStyle w:val="Compact"/>
+              <w:jc w:val="left"/>
+            </w:pPr>
+            <w:r>
+              <w:t xml:space="preserve">ACRME-S2004</w:t>
+            </w:r>
+          </w:p>
+        </w:tc>
+        <w:tc>
+          <w:tcPr/>
+          <w:p>
+            <w:pPr>
+              <w:pStyle w:val="Compact"/>
+              <w:jc w:val="left"/>
+            </w:pPr>
+            <w:r>
+              <w:t xml:space="preserve">Reactive SKU/AZ discovery auto-create with scope-file governance</w:t>
+            </w:r>
+          </w:p>
+        </w:tc>
+        <w:tc>
+          <w:tcPr/>
+          <w:p>
+            <w:pPr>
+              <w:pStyle w:val="Compact"/>
+              <w:jc w:val="left"/>
+            </w:pPr>
+            <w:r>
+              <w:t xml:space="preserve">High</w:t>
+            </w:r>
+          </w:p>
+        </w:tc>
+        <w:tc>
+          <w:tcPr/>
+          <w:p>
+            <w:pPr>
+              <w:pStyle w:val="Compact"/>
+              <w:jc w:val="left"/>
+            </w:pPr>
+            <w:r>
+              <w:t xml:space="preserve">5</w:t>
+            </w:r>
+          </w:p>
+        </w:tc>
+        <w:tc>
+          <w:tcPr/>
+          <w:p>
+            <w:pPr>
+              <w:pStyle w:val="Compact"/>
+              <w:jc w:val="left"/>
+            </w:pPr>
+            <w:r>
+              <w:t xml:space="preserve">P2</w:t>
+            </w:r>
+          </w:p>
+        </w:tc>
+        <w:tc>
+          <w:tcPr/>
+          <w:p>
+            <w:pPr>
+              <w:pStyle w:val="Compact"/>
+              <w:jc w:val="left"/>
+            </w:pPr>
+            <w:r>
+              <w:t xml:space="preserve">ACRME-S2002, ACRME-S2003</w:t>
+            </w:r>
+          </w:p>
+        </w:tc>
+      </w:tr>
+      <w:tr>
+        <w:tc>
+          <w:tcPr/>
+          <w:p>
+            <w:pPr>
+              <w:pStyle w:val="Compact"/>
+              <w:jc w:val="left"/>
+            </w:pPr>
+            <w:r>
+              <w:t xml:space="preserve">ACRME-S2005</w:t>
+            </w:r>
+          </w:p>
+        </w:tc>
+        <w:tc>
+          <w:tcPr/>
+          <w:p>
+            <w:pPr>
+              <w:pStyle w:val="Compact"/>
+              <w:jc w:val="left"/>
+            </w:pPr>
+            <w:r>
+              <w:t xml:space="preserve">Even zone-distribution target and rebalancing action</w:t>
+            </w:r>
+          </w:p>
+        </w:tc>
+        <w:tc>
+          <w:tcPr/>
+          <w:p>
+            <w:pPr>
+              <w:pStyle w:val="Compact"/>
+              <w:jc w:val="left"/>
+            </w:pPr>
+            <w:r>
+              <w:t xml:space="preserve">High</w:t>
+            </w:r>
+          </w:p>
+        </w:tc>
+        <w:tc>
+          <w:tcPr/>
+          <w:p>
+            <w:pPr>
+              <w:pStyle w:val="Compact"/>
+              <w:jc w:val="left"/>
+            </w:pPr>
+            <w:r>
+              <w:t xml:space="preserve">5</w:t>
+            </w:r>
+          </w:p>
+        </w:tc>
+        <w:tc>
+          <w:tcPr/>
+          <w:p>
+            <w:pPr>
+              <w:pStyle w:val="Compact"/>
+              <w:jc w:val="left"/>
+            </w:pPr>
+            <w:r>
+              <w:t xml:space="preserve">P2</w:t>
+            </w:r>
+          </w:p>
+        </w:tc>
+        <w:tc>
+          <w:tcPr/>
+          <w:p>
+            <w:pPr>
+              <w:pStyle w:val="Compact"/>
+              <w:jc w:val="left"/>
+            </w:pPr>
+            <w:r>
+              <w:t xml:space="preserve">ACRME-S2003, ACRME-S0701</w:t>
+            </w:r>
+          </w:p>
+        </w:tc>
+      </w:tr>
+      <w:tr>
+        <w:tc>
+          <w:tcPr/>
+          <w:p>
+            <w:pPr>
+              <w:pStyle w:val="Compact"/>
+              <w:jc w:val="left"/>
+            </w:pPr>
+            <w:r>
+              <w:t xml:space="preserve">ACRME-S2006</w:t>
+            </w:r>
+          </w:p>
+        </w:tc>
+        <w:tc>
+          <w:tcPr/>
+          <w:p>
+            <w:pPr>
+              <w:pStyle w:val="Compact"/>
+              <w:jc w:val="left"/>
+            </w:pPr>
+            <w:r>
+              <w:t xml:space="preserve">Deterministic RG/CRG/subscription naming convention &amp; counter</w:t>
+            </w:r>
+          </w:p>
+        </w:tc>
+        <w:tc>
+          <w:tcPr/>
+          <w:p>
+            <w:pPr>
+              <w:pStyle w:val="Compact"/>
+              <w:jc w:val="left"/>
+            </w:pPr>
+            <w:r>
+              <w:t xml:space="preserve">Medium</w:t>
+            </w:r>
+          </w:p>
+        </w:tc>
+        <w:tc>
+          <w:tcPr/>
+          <w:p>
+            <w:pPr>
+              <w:pStyle w:val="Compact"/>
+              <w:jc w:val="left"/>
+            </w:pPr>
+            <w:r>
+              <w:t xml:space="preserve">3</w:t>
+            </w:r>
+          </w:p>
+        </w:tc>
+        <w:tc>
+          <w:tcPr/>
+          <w:p>
+            <w:pPr>
+              <w:pStyle w:val="Compact"/>
+              <w:jc w:val="left"/>
+            </w:pPr>
+            <w:r>
+              <w:t xml:space="preserve">P1</w:t>
+            </w:r>
+          </w:p>
+        </w:tc>
+        <w:tc>
+          <w:tcPr/>
+          <w:p>
+            <w:pPr>
+              <w:pStyle w:val="Compact"/>
+              <w:jc w:val="left"/>
+            </w:pPr>
+            <w:r>
+              <w:t xml:space="preserve">—</w:t>
+            </w:r>
+          </w:p>
+        </w:tc>
+      </w:tr>
+    </w:tbl>
+    <w:bookmarkStart w:id="111" w:name="Xda5f0ee9828c8f52a4a4d49ca53507f8a2389b8"/>
+    <w:p>
+      <w:pPr>
+        <w:pStyle w:val="Heading4"/>
+      </w:pPr>
+      <w:r>
+        <w:t xml:space="preserve">ACRME-S2001 — Reservation eligibility gate — Availability-Set ineligibility &amp; AZ onboarding precondition</w:t>
+      </w:r>
+    </w:p>
+    <w:p>
+      <w:pPr>
+        <w:pStyle w:val="BlockText"/>
+      </w:pPr>
+      <w:r>
+        <w:rPr>
+          <w:bCs/>
+          <w:b/>
+        </w:rPr>
+        <w:t xml:space="preserve">As a</w:t>
+      </w:r>
+      <w:r>
+        <w:t xml:space="preserve"> </w:t>
+      </w:r>
+      <w:r>
+        <w:t xml:space="preserve">onboarding engineer,</w:t>
+      </w:r>
+      <w:r>
+        <w:t xml:space="preserve"> </w:t>
+      </w:r>
+      <w:r>
+        <w:rPr>
+          <w:bCs/>
+          <w:b/>
+        </w:rPr>
+        <w:t xml:space="preserve">I want</w:t>
+      </w:r>
+      <w:r>
+        <w:t xml:space="preserve"> </w:t>
+      </w:r>
+      <w:r>
+        <w:t xml:space="preserve">the engine to reject reservation onboarding for Availability-Set VMs and require deallocate/redeploy-to-AZ first,</w:t>
+      </w:r>
+      <w:r>
+        <w:t xml:space="preserve"> </w:t>
+      </w:r>
+      <w:r>
+        <w:rPr>
+          <w:bCs/>
+          <w:b/>
+        </w:rPr>
+        <w:t xml:space="preserve">so that</w:t>
+      </w:r>
+      <w:r>
+        <w:t xml:space="preserve"> </w:t>
+      </w:r>
+      <w:r>
+        <w:t xml:space="preserve">only zone-aligned, reservation-eligible VMs enter the CRG model (CAP-020, CAP-021).</w:t>
+      </w:r>
+    </w:p>
+    <w:p>
+      <w:pPr>
+        <w:numPr>
+          <w:ilvl w:val="0"/>
+          <w:numId w:val="1200"/>
+        </w:numPr>
+        <w:pStyle w:val="Compact"/>
+      </w:pPr>
+      <w:r>
+        <w:rPr>
+          <w:bCs/>
+          <w:b/>
+        </w:rPr>
+        <w:t xml:space="preserve">Priority:</w:t>
+      </w:r>
+      <w:r>
+        <w:t xml:space="preserve"> </w:t>
+      </w:r>
+      <w:r>
+        <w:t xml:space="preserve">Highest ·</w:t>
+      </w:r>
+      <w:r>
+        <w:t xml:space="preserve"> </w:t>
+      </w:r>
+      <w:r>
+        <w:rPr>
+          <w:bCs/>
+          <w:b/>
+        </w:rPr>
+        <w:t xml:space="preserve">Points:</w:t>
+      </w:r>
+      <w:r>
+        <w:t xml:space="preserve"> </w:t>
+      </w:r>
+      <w:r>
+        <w:t xml:space="preserve">5 ·</w:t>
+      </w:r>
+      <w:r>
+        <w:t xml:space="preserve"> </w:t>
+      </w:r>
+      <w:r>
+        <w:rPr>
+          <w:bCs/>
+          <w:b/>
+        </w:rPr>
+        <w:t xml:space="preserve">Phase:</w:t>
+      </w:r>
+      <w:r>
+        <w:t xml:space="preserve"> </w:t>
+      </w:r>
+      <w:r>
+        <w:t xml:space="preserve">P1</w:t>
+      </w:r>
+    </w:p>
+    <w:p>
+      <w:pPr>
+        <w:numPr>
+          <w:ilvl w:val="0"/>
+          <w:numId w:val="1200"/>
+        </w:numPr>
+        <w:pStyle w:val="Compact"/>
+      </w:pPr>
+      <w:r>
+        <w:rPr>
+          <w:bCs/>
+          <w:b/>
+        </w:rPr>
+        <w:t xml:space="preserve">PRR refs:</w:t>
+      </w:r>
+      <w:r>
+        <w:t xml:space="preserve"> </w:t>
+      </w:r>
+      <w:r>
+        <w:t xml:space="preserve">CAP-020, CAP-021</w:t>
+      </w:r>
+    </w:p>
+    <w:p>
+      <w:pPr>
+        <w:numPr>
+          <w:ilvl w:val="0"/>
+          <w:numId w:val="1200"/>
+        </w:numPr>
+        <w:pStyle w:val="Compact"/>
+      </w:pPr>
+      <w:r>
+        <w:rPr>
+          <w:bCs/>
+          <w:b/>
+        </w:rPr>
+        <w:t xml:space="preserve">Depends on:</w:t>
+      </w:r>
+      <w:r>
+        <w:t xml:space="preserve"> </w:t>
+      </w:r>
+      <w:r>
+        <w:t xml:space="preserve">ACRME-S0201</w:t>
+      </w:r>
+    </w:p>
+    <w:p>
+      <w:pPr>
+        <w:pStyle w:val="FirstParagraph"/>
+      </w:pPr>
+      <w:r>
+        <w:rPr>
+          <w:bCs/>
+          <w:b/>
+        </w:rPr>
+        <w:t xml:space="preserve">Acceptance criteria</w:t>
+      </w:r>
+    </w:p>
+    <w:p>
+      <w:pPr>
+        <w:numPr>
+          <w:ilvl w:val="0"/>
+          <w:numId w:val="1201"/>
+        </w:numPr>
+        <w:pStyle w:val="Compact"/>
+      </w:pPr>
+      <w:r>
+        <w:t xml:space="preserve">VMs deployed in an Availability Set are classified reservation-ineligible and blocked from CRG onboarding (CAP-020).</w:t>
+      </w:r>
+    </w:p>
+    <w:p>
+      <w:pPr>
+        <w:numPr>
+          <w:ilvl w:val="0"/>
+          <w:numId w:val="1201"/>
+        </w:numPr>
+        <w:pStyle w:val="Compact"/>
+      </w:pPr>
+      <w:r>
+        <w:t xml:space="preserve">Onboarding a running non-zonal VM requires the deallocate-or-redeploy-to-an-availability-zone precondition to be satisfied first (CAP-021).</w:t>
+      </w:r>
+    </w:p>
+    <w:p>
+      <w:pPr>
+        <w:numPr>
+          <w:ilvl w:val="0"/>
+          <w:numId w:val="1201"/>
+        </w:numPr>
+        <w:pStyle w:val="Compact"/>
+      </w:pPr>
+      <w:r>
+        <w:t xml:space="preserve">The</w:t>
+      </w:r>
+      <w:r>
+        <w:t xml:space="preserve"> </w:t>
+      </w:r>
+      <w:r>
+        <w:rPr>
+          <w:rStyle w:val="VerbatimChar"/>
+        </w:rPr>
+        <w:t xml:space="preserve">ReservationEligibility</w:t>
+      </w:r>
+      <w:r>
+        <w:t xml:space="preserve"> </w:t>
+      </w:r>
+      <w:r>
+        <w:t xml:space="preserve">record captures ineligibility reason and the onboarding precondition state.</w:t>
+      </w:r>
+    </w:p>
+    <w:p>
+      <w:pPr>
+        <w:numPr>
+          <w:ilvl w:val="0"/>
+          <w:numId w:val="1201"/>
+        </w:numPr>
+        <w:pStyle w:val="Compact"/>
+      </w:pPr>
+      <w:r>
+        <w:t xml:space="preserve">A blocked onboarding returns a deterministic, actionable error and raises a governance item.</w:t>
+      </w:r>
+    </w:p>
+    <w:p>
+      <w:pPr>
+        <w:pStyle w:val="FirstParagraph"/>
+      </w:pPr>
+      <w:r>
+        <w:rPr>
+          <w:bCs/>
+          <w:b/>
+        </w:rPr>
+        <w:t xml:space="preserve">Tasks</w:t>
+      </w:r>
+    </w:p>
+    <w:p>
+      <w:pPr>
+        <w:numPr>
+          <w:ilvl w:val="0"/>
+          <w:numId w:val="1202"/>
+        </w:numPr>
+        <w:pStyle w:val="Compact"/>
+      </w:pPr>
+      <w:r>
+        <w:t xml:space="preserve">☐</w:t>
+      </w:r>
+      <w:r>
+        <w:t xml:space="preserve"> </w:t>
+      </w:r>
+      <w:r>
+        <w:rPr>
+          <w:rStyle w:val="VerbatimChar"/>
+        </w:rPr>
+        <w:t xml:space="preserve">ACRME-T200101</w:t>
+      </w:r>
+      <w:r>
+        <w:t xml:space="preserve"> </w:t>
+      </w:r>
+      <w:r>
+        <w:t xml:space="preserve">Implement Availability-Set detection and reservation-ineligibility classification (CAP-020)</w:t>
+      </w:r>
+    </w:p>
+    <w:p>
+      <w:pPr>
+        <w:numPr>
+          <w:ilvl w:val="0"/>
+          <w:numId w:val="1202"/>
+        </w:numPr>
+        <w:pStyle w:val="Compact"/>
+      </w:pPr>
+      <w:r>
+        <w:t xml:space="preserve">☐</w:t>
+      </w:r>
+      <w:r>
+        <w:t xml:space="preserve"> </w:t>
+      </w:r>
+      <w:r>
+        <w:rPr>
+          <w:rStyle w:val="VerbatimChar"/>
+        </w:rPr>
+        <w:t xml:space="preserve">ACRME-T200102</w:t>
+      </w:r>
+      <w:r>
+        <w:t xml:space="preserve"> </w:t>
+      </w:r>
+      <w:r>
+        <w:t xml:space="preserve">Implement deallocate/redeploy-to-AZ onboarding precondition check (CAP-021)</w:t>
+      </w:r>
+    </w:p>
+    <w:p>
+      <w:pPr>
+        <w:numPr>
+          <w:ilvl w:val="0"/>
+          <w:numId w:val="1202"/>
+        </w:numPr>
+        <w:pStyle w:val="Compact"/>
+      </w:pPr>
+      <w:r>
+        <w:t xml:space="preserve">☐</w:t>
+      </w:r>
+      <w:r>
+        <w:t xml:space="preserve"> </w:t>
+      </w:r>
+      <w:r>
+        <w:rPr>
+          <w:rStyle w:val="VerbatimChar"/>
+        </w:rPr>
+        <w:t xml:space="preserve">ACRME-T200103</w:t>
+      </w:r>
+      <w:r>
+        <w:t xml:space="preserve"> </w:t>
+      </w:r>
+      <w:r>
+        <w:t xml:space="preserve">Persist ReservationEligibility record with reason + precondition state</w:t>
+      </w:r>
+    </w:p>
     <w:bookmarkEnd w:id="111"/>
+    <w:bookmarkStart w:id="112" w:name="Xf37f14209300fb58d6c125f36dbaee60826e690"/>
+    <w:p>
+      <w:pPr>
+        <w:pStyle w:val="Heading4"/>
+      </w:pPr>
+      <w:r>
+        <w:t xml:space="preserve">ACRME-S2002 — Seed-at-0 SKU/AZ matrix and product-team budget governance</w:t>
+      </w:r>
+    </w:p>
+    <w:p>
+      <w:pPr>
+        <w:pStyle w:val="BlockText"/>
+      </w:pPr>
+      <w:r>
+        <w:rPr>
+          <w:bCs/>
+          <w:b/>
+        </w:rPr>
+        <w:t xml:space="preserve">As a</w:t>
+      </w:r>
+      <w:r>
+        <w:t xml:space="preserve"> </w:t>
+      </w:r>
+      <w:r>
+        <w:t xml:space="preserve">capacity governance owner,</w:t>
+      </w:r>
+      <w:r>
+        <w:t xml:space="preserve"> </w:t>
+      </w:r>
+      <w:r>
+        <w:rPr>
+          <w:bCs/>
+          <w:b/>
+        </w:rPr>
+        <w:t xml:space="preserve">I want</w:t>
+      </w:r>
+      <w:r>
+        <w:t xml:space="preserve"> </w:t>
+      </w:r>
+      <w:r>
+        <w:t xml:space="preserve">an eligible-SKU/AZ seed matrix initialised at count 0 under product-team budget governance,</w:t>
+      </w:r>
+      <w:r>
+        <w:t xml:space="preserve"> </w:t>
+      </w:r>
+      <w:r>
+        <w:rPr>
+          <w:bCs/>
+          <w:b/>
+        </w:rPr>
+        <w:t xml:space="preserve">so that</w:t>
+      </w:r>
+      <w:r>
+        <w:t xml:space="preserve"> </w:t>
+      </w:r>
+      <w:r>
+        <w:t xml:space="preserve">reservations exist as governed placeholders before demand, extending the CAP-009 seed model (CAP-022).</w:t>
+      </w:r>
+    </w:p>
+    <w:p>
+      <w:pPr>
+        <w:numPr>
+          <w:ilvl w:val="0"/>
+          <w:numId w:val="1203"/>
+        </w:numPr>
+        <w:pStyle w:val="Compact"/>
+      </w:pPr>
+      <w:r>
+        <w:rPr>
+          <w:bCs/>
+          <w:b/>
+        </w:rPr>
+        <w:t xml:space="preserve">Priority:</w:t>
+      </w:r>
+      <w:r>
+        <w:t xml:space="preserve"> </w:t>
+      </w:r>
+      <w:r>
+        <w:t xml:space="preserve">Highest ·</w:t>
+      </w:r>
+      <w:r>
+        <w:t xml:space="preserve"> </w:t>
+      </w:r>
+      <w:r>
+        <w:rPr>
+          <w:bCs/>
+          <w:b/>
+        </w:rPr>
+        <w:t xml:space="preserve">Points:</w:t>
+      </w:r>
+      <w:r>
+        <w:t xml:space="preserve"> </w:t>
+      </w:r>
+      <w:r>
+        <w:t xml:space="preserve">8 ·</w:t>
+      </w:r>
+      <w:r>
+        <w:t xml:space="preserve"> </w:t>
+      </w:r>
+      <w:r>
+        <w:rPr>
+          <w:bCs/>
+          <w:b/>
+        </w:rPr>
+        <w:t xml:space="preserve">Phase:</w:t>
+      </w:r>
+      <w:r>
+        <w:t xml:space="preserve"> </w:t>
+      </w:r>
+      <w:r>
+        <w:t xml:space="preserve">P1</w:t>
+      </w:r>
+    </w:p>
+    <w:p>
+      <w:pPr>
+        <w:numPr>
+          <w:ilvl w:val="0"/>
+          <w:numId w:val="1203"/>
+        </w:numPr>
+        <w:pStyle w:val="Compact"/>
+      </w:pPr>
+      <w:r>
+        <w:rPr>
+          <w:bCs/>
+          <w:b/>
+        </w:rPr>
+        <w:t xml:space="preserve">PRR refs:</w:t>
+      </w:r>
+      <w:r>
+        <w:t xml:space="preserve"> </w:t>
+      </w:r>
+      <w:r>
+        <w:t xml:space="preserve">CAP-022, CAP-009</w:t>
+      </w:r>
+    </w:p>
+    <w:p>
+      <w:pPr>
+        <w:numPr>
+          <w:ilvl w:val="0"/>
+          <w:numId w:val="1203"/>
+        </w:numPr>
+        <w:pStyle w:val="Compact"/>
+      </w:pPr>
+      <w:r>
+        <w:rPr>
+          <w:bCs/>
+          <w:b/>
+        </w:rPr>
+        <w:t xml:space="preserve">Depends on:</w:t>
+      </w:r>
+      <w:r>
+        <w:t xml:space="preserve"> </w:t>
+      </w:r>
+      <w:r>
+        <w:t xml:space="preserve">ACRME-S0301</w:t>
+      </w:r>
+    </w:p>
+    <w:p>
+      <w:pPr>
+        <w:pStyle w:val="FirstParagraph"/>
+      </w:pPr>
+      <w:r>
+        <w:rPr>
+          <w:bCs/>
+          <w:b/>
+        </w:rPr>
+        <w:t xml:space="preserve">Acceptance criteria</w:t>
+      </w:r>
+    </w:p>
+    <w:p>
+      <w:pPr>
+        <w:numPr>
+          <w:ilvl w:val="0"/>
+          <w:numId w:val="1204"/>
+        </w:numPr>
+        <w:pStyle w:val="Compact"/>
+      </w:pPr>
+      <w:r>
+        <w:t xml:space="preserve">The seed matrix enumerates eligible SKU × AZ combinations with initial reserved count 0 (seed reservations).</w:t>
+      </w:r>
+    </w:p>
+    <w:p>
+      <w:pPr>
+        <w:numPr>
+          <w:ilvl w:val="0"/>
+          <w:numId w:val="1204"/>
+        </w:numPr>
+        <w:pStyle w:val="Compact"/>
+      </w:pPr>
+      <w:r>
+        <w:t xml:space="preserve">Product-team budget governance approves any increase of a seed reservation above 0.</w:t>
+      </w:r>
+    </w:p>
+    <w:p>
+      <w:pPr>
+        <w:numPr>
+          <w:ilvl w:val="0"/>
+          <w:numId w:val="1204"/>
+        </w:numPr>
+        <w:pStyle w:val="Compact"/>
+      </w:pPr>
+      <w:r>
+        <w:rPr>
+          <w:rStyle w:val="VerbatimChar"/>
+        </w:rPr>
+        <w:t xml:space="preserve">SeedMatrixEntry</w:t>
+      </w:r>
+      <w:r>
+        <w:t xml:space="preserve"> </w:t>
+      </w:r>
+      <w:r>
+        <w:t xml:space="preserve">records SKU, AZ, environment, governance status, and current count.</w:t>
+      </w:r>
+    </w:p>
+    <w:p>
+      <w:pPr>
+        <w:numPr>
+          <w:ilvl w:val="0"/>
+          <w:numId w:val="1204"/>
+        </w:numPr>
+        <w:pStyle w:val="Compact"/>
+      </w:pPr>
+      <w:r>
+        <w:t xml:space="preserve">Seed reservations are distinguished from active reservations (</w:t>
+      </w:r>
+      <w:r>
+        <w:rPr>
+          <w:rStyle w:val="VerbatimChar"/>
+        </w:rPr>
+        <w:t xml:space="preserve">reservationType = SEED</w:t>
+      </w:r>
+      <w:r>
+        <w:t xml:space="preserve">).</w:t>
+      </w:r>
+    </w:p>
+    <w:p>
+      <w:pPr>
+        <w:pStyle w:val="FirstParagraph"/>
+      </w:pPr>
+      <w:r>
+        <w:rPr>
+          <w:bCs/>
+          <w:b/>
+        </w:rPr>
+        <w:t xml:space="preserve">Tasks</w:t>
+      </w:r>
+    </w:p>
+    <w:p>
+      <w:pPr>
+        <w:numPr>
+          <w:ilvl w:val="0"/>
+          <w:numId w:val="1205"/>
+        </w:numPr>
+        <w:pStyle w:val="Compact"/>
+      </w:pPr>
+      <w:r>
+        <w:t xml:space="preserve">☐</w:t>
+      </w:r>
+      <w:r>
+        <w:t xml:space="preserve"> </w:t>
+      </w:r>
+      <w:r>
+        <w:rPr>
+          <w:rStyle w:val="VerbatimChar"/>
+        </w:rPr>
+        <w:t xml:space="preserve">ACRME-T200201</w:t>
+      </w:r>
+      <w:r>
+        <w:t xml:space="preserve"> </w:t>
+      </w:r>
+      <w:r>
+        <w:t xml:space="preserve">Model SeedMatrixEntry (SKU × AZ × env, count-0 seed) per CAP-022</w:t>
+      </w:r>
+    </w:p>
+    <w:p>
+      <w:pPr>
+        <w:numPr>
+          <w:ilvl w:val="0"/>
+          <w:numId w:val="1205"/>
+        </w:numPr>
+        <w:pStyle w:val="Compact"/>
+      </w:pPr>
+      <w:r>
+        <w:t xml:space="preserve">☐</w:t>
+      </w:r>
+      <w:r>
+        <w:t xml:space="preserve"> </w:t>
+      </w:r>
+      <w:r>
+        <w:rPr>
+          <w:rStyle w:val="VerbatimChar"/>
+        </w:rPr>
+        <w:t xml:space="preserve">ACRME-T200202</w:t>
+      </w:r>
+      <w:r>
+        <w:t xml:space="preserve"> </w:t>
+      </w:r>
+      <w:r>
+        <w:t xml:space="preserve">Implement product-team budget-governance gate for seed increases</w:t>
+      </w:r>
+    </w:p>
+    <w:p>
+      <w:pPr>
+        <w:numPr>
+          <w:ilvl w:val="0"/>
+          <w:numId w:val="1205"/>
+        </w:numPr>
+        <w:pStyle w:val="Compact"/>
+      </w:pPr>
+      <w:r>
+        <w:t xml:space="preserve">☐</w:t>
+      </w:r>
+      <w:r>
+        <w:t xml:space="preserve"> </w:t>
+      </w:r>
+      <w:r>
+        <w:rPr>
+          <w:rStyle w:val="VerbatimChar"/>
+        </w:rPr>
+        <w:t xml:space="preserve">ACRME-T200203</w:t>
+      </w:r>
+      <w:r>
+        <w:t xml:space="preserve"> </w:t>
+      </w:r>
+      <w:r>
+        <w:t xml:space="preserve">Distinguish SEED vs ACTIVE reservationType in the reservation model</w:t>
+      </w:r>
+    </w:p>
     <w:bookmarkEnd w:id="112"/>
+    <w:bookmarkStart w:id="113" w:name="X2f62dfa810a1a9847f3a442b6164176f9049630"/>
+    <w:p>
+      <w:pPr>
+        <w:pStyle w:val="Heading4"/>
+      </w:pPr>
+      <w:r>
+        <w:t xml:space="preserve">ACRME-S2003 — Explicit regional + per-AZ CRG structure per environment</w:t>
+      </w:r>
+    </w:p>
+    <w:p>
+      <w:pPr>
+        <w:pStyle w:val="BlockText"/>
+      </w:pPr>
+      <w:r>
+        <w:rPr>
+          <w:bCs/>
+          <w:b/>
+        </w:rPr>
+        <w:t xml:space="preserve">As a</w:t>
+      </w:r>
+      <w:r>
+        <w:t xml:space="preserve"> </w:t>
+      </w:r>
+      <w:r>
+        <w:t xml:space="preserve">capacity engineer,</w:t>
+      </w:r>
+      <w:r>
+        <w:t xml:space="preserve"> </w:t>
+      </w:r>
+      <w:r>
+        <w:rPr>
+          <w:bCs/>
+          <w:b/>
+        </w:rPr>
+        <w:t xml:space="preserve">I want</w:t>
+      </w:r>
+      <w:r>
+        <w:t xml:space="preserve"> </w:t>
+      </w:r>
+      <w:r>
+        <w:t xml:space="preserve">each environment provisioned with one regional CRG plus one CRG per availability zone,</w:t>
+      </w:r>
+      <w:r>
+        <w:t xml:space="preserve"> </w:t>
+      </w:r>
+      <w:r>
+        <w:rPr>
+          <w:bCs/>
+          <w:b/>
+        </w:rPr>
+        <w:t xml:space="preserve">so that</w:t>
+      </w:r>
+      <w:r>
+        <w:t xml:space="preserve"> </w:t>
+      </w:r>
+      <w:r>
+        <w:t xml:space="preserve">reservations are held at the correct regional/zonal scope, extending CAP-011 (CAP-023).</w:t>
+      </w:r>
+    </w:p>
+    <w:p>
+      <w:pPr>
+        <w:numPr>
+          <w:ilvl w:val="0"/>
+          <w:numId w:val="1206"/>
+        </w:numPr>
+        <w:pStyle w:val="Compact"/>
+      </w:pPr>
+      <w:r>
+        <w:rPr>
+          <w:bCs/>
+          <w:b/>
+        </w:rPr>
+        <w:t xml:space="preserve">Priority:</w:t>
+      </w:r>
+      <w:r>
+        <w:t xml:space="preserve"> </w:t>
+      </w:r>
+      <w:r>
+        <w:t xml:space="preserve">High ·</w:t>
+      </w:r>
+      <w:r>
+        <w:t xml:space="preserve"> </w:t>
+      </w:r>
+      <w:r>
+        <w:rPr>
+          <w:bCs/>
+          <w:b/>
+        </w:rPr>
+        <w:t xml:space="preserve">Points:</w:t>
+      </w:r>
+      <w:r>
+        <w:t xml:space="preserve"> </w:t>
+      </w:r>
+      <w:r>
+        <w:t xml:space="preserve">5 ·</w:t>
+      </w:r>
+      <w:r>
+        <w:t xml:space="preserve"> </w:t>
+      </w:r>
+      <w:r>
+        <w:rPr>
+          <w:bCs/>
+          <w:b/>
+        </w:rPr>
+        <w:t xml:space="preserve">Phase:</w:t>
+      </w:r>
+      <w:r>
+        <w:t xml:space="preserve"> </w:t>
+      </w:r>
+      <w:r>
+        <w:t xml:space="preserve">P1</w:t>
+      </w:r>
+    </w:p>
+    <w:p>
+      <w:pPr>
+        <w:numPr>
+          <w:ilvl w:val="0"/>
+          <w:numId w:val="1206"/>
+        </w:numPr>
+        <w:pStyle w:val="Compact"/>
+      </w:pPr>
+      <w:r>
+        <w:rPr>
+          <w:bCs/>
+          <w:b/>
+        </w:rPr>
+        <w:t xml:space="preserve">PRR refs:</w:t>
+      </w:r>
+      <w:r>
+        <w:t xml:space="preserve"> </w:t>
+      </w:r>
+      <w:r>
+        <w:t xml:space="preserve">CAP-023, CAP-011, OPS-006</w:t>
+      </w:r>
+    </w:p>
+    <w:p>
+      <w:pPr>
+        <w:numPr>
+          <w:ilvl w:val="0"/>
+          <w:numId w:val="1206"/>
+        </w:numPr>
+        <w:pStyle w:val="Compact"/>
+      </w:pPr>
+      <w:r>
+        <w:rPr>
+          <w:bCs/>
+          <w:b/>
+        </w:rPr>
+        <w:t xml:space="preserve">Depends on:</w:t>
+      </w:r>
+      <w:r>
+        <w:t xml:space="preserve"> </w:t>
+      </w:r>
+      <w:r>
+        <w:t xml:space="preserve">ACRME-S0301</w:t>
+      </w:r>
+    </w:p>
+    <w:p>
+      <w:pPr>
+        <w:pStyle w:val="FirstParagraph"/>
+      </w:pPr>
+      <w:r>
+        <w:rPr>
+          <w:bCs/>
+          <w:b/>
+        </w:rPr>
+        <w:t xml:space="preserve">Acceptance criteria</w:t>
+      </w:r>
+    </w:p>
+    <w:p>
+      <w:pPr>
+        <w:numPr>
+          <w:ilvl w:val="0"/>
+          <w:numId w:val="1207"/>
+        </w:numPr>
+        <w:pStyle w:val="Compact"/>
+      </w:pPr>
+      <w:r>
+        <w:t xml:space="preserve">Each environment (Prod, NonProd, DR) has one regional CRG (</w:t>
+      </w:r>
+      <w:r>
+        <w:rPr>
+          <w:rStyle w:val="VerbatimChar"/>
+        </w:rPr>
+        <w:t xml:space="preserve">crg-&lt;env&gt;-&lt;region&gt;-reg</w:t>
+      </w:r>
+      <w:r>
+        <w:t xml:space="preserve">) and one CRG per AZ (</w:t>
+      </w:r>
+      <w:r>
+        <w:rPr>
+          <w:rStyle w:val="VerbatimChar"/>
+        </w:rPr>
+        <w:t xml:space="preserve">az1/az2/az3</w:t>
+      </w:r>
+      <w:r>
+        <w:t xml:space="preserve">).</w:t>
+      </w:r>
+    </w:p>
+    <w:p>
+      <w:pPr>
+        <w:numPr>
+          <w:ilvl w:val="0"/>
+          <w:numId w:val="1207"/>
+        </w:numPr>
+        <w:pStyle w:val="Compact"/>
+      </w:pPr>
+      <w:r>
+        <w:rPr>
+          <w:rStyle w:val="VerbatimChar"/>
+        </w:rPr>
+        <w:t xml:space="preserve">CapacityReservationGroup</w:t>
+      </w:r>
+      <w:r>
+        <w:t xml:space="preserve"> </w:t>
+      </w:r>
+      <w:r>
+        <w:t xml:space="preserve">carries</w:t>
+      </w:r>
+      <w:r>
+        <w:t xml:space="preserve"> </w:t>
+      </w:r>
+      <w:r>
+        <w:rPr>
+          <w:rStyle w:val="VerbatimChar"/>
+        </w:rPr>
+        <w:t xml:space="preserve">environment</w:t>
+      </w:r>
+      <w:r>
+        <w:t xml:space="preserve"> </w:t>
+      </w:r>
+      <w:r>
+        <w:t xml:space="preserve">and</w:t>
+      </w:r>
+      <w:r>
+        <w:t xml:space="preserve"> </w:t>
+      </w:r>
+      <w:r>
+        <w:rPr>
+          <w:rStyle w:val="VerbatimChar"/>
+        </w:rPr>
+        <w:t xml:space="preserve">crgScope</w:t>
+      </w:r>
+      <w:r>
+        <w:t xml:space="preserve"> </w:t>
+      </w:r>
+      <w:r>
+        <w:t xml:space="preserve">(REGIONAL | ZONAL).</w:t>
+      </w:r>
+    </w:p>
+    <w:p>
+      <w:pPr>
+        <w:numPr>
+          <w:ilvl w:val="0"/>
+          <w:numId w:val="1207"/>
+        </w:numPr>
+        <w:pStyle w:val="Compact"/>
+      </w:pPr>
+      <w:r>
+        <w:t xml:space="preserve">CRG names are generated deterministically per OPS-006/C-12.</w:t>
+      </w:r>
+    </w:p>
+    <w:p>
+      <w:pPr>
+        <w:numPr>
+          <w:ilvl w:val="0"/>
+          <w:numId w:val="1207"/>
+        </w:numPr>
+        <w:pStyle w:val="Compact"/>
+      </w:pPr>
+      <w:r>
+        <w:t xml:space="preserve">Per-AZ CRG sizing aligns with the even zone-distribution target (PLC-011).</w:t>
+      </w:r>
+    </w:p>
+    <w:p>
+      <w:pPr>
+        <w:pStyle w:val="FirstParagraph"/>
+      </w:pPr>
+      <w:r>
+        <w:rPr>
+          <w:bCs/>
+          <w:b/>
+        </w:rPr>
+        <w:t xml:space="preserve">Tasks</w:t>
+      </w:r>
+    </w:p>
+    <w:p>
+      <w:pPr>
+        <w:numPr>
+          <w:ilvl w:val="0"/>
+          <w:numId w:val="1208"/>
+        </w:numPr>
+        <w:pStyle w:val="Compact"/>
+      </w:pPr>
+      <w:r>
+        <w:t xml:space="preserve">☐</w:t>
+      </w:r>
+      <w:r>
+        <w:t xml:space="preserve"> </w:t>
+      </w:r>
+      <w:r>
+        <w:rPr>
+          <w:rStyle w:val="VerbatimChar"/>
+        </w:rPr>
+        <w:t xml:space="preserve">ACRME-T200301</w:t>
+      </w:r>
+      <w:r>
+        <w:t xml:space="preserve"> </w:t>
+      </w:r>
+      <w:r>
+        <w:t xml:space="preserve">Provision regional + per-AZ CRG set per environment (CAP-023)</w:t>
+      </w:r>
+    </w:p>
+    <w:p>
+      <w:pPr>
+        <w:numPr>
+          <w:ilvl w:val="0"/>
+          <w:numId w:val="1208"/>
+        </w:numPr>
+        <w:pStyle w:val="Compact"/>
+      </w:pPr>
+      <w:r>
+        <w:t xml:space="preserve">☐</w:t>
+      </w:r>
+      <w:r>
+        <w:t xml:space="preserve"> </w:t>
+      </w:r>
+      <w:r>
+        <w:rPr>
+          <w:rStyle w:val="VerbatimChar"/>
+        </w:rPr>
+        <w:t xml:space="preserve">ACRME-T200302</w:t>
+      </w:r>
+      <w:r>
+        <w:t xml:space="preserve"> </w:t>
+      </w:r>
+      <w:r>
+        <w:t xml:space="preserve">Add environment + crgScope to CRG model and provisioning</w:t>
+      </w:r>
+    </w:p>
+    <w:p>
+      <w:pPr>
+        <w:numPr>
+          <w:ilvl w:val="0"/>
+          <w:numId w:val="1208"/>
+        </w:numPr>
+        <w:pStyle w:val="Compact"/>
+      </w:pPr>
+      <w:r>
+        <w:t xml:space="preserve">☐</w:t>
+      </w:r>
+      <w:r>
+        <w:t xml:space="preserve"> </w:t>
+      </w:r>
+      <w:r>
+        <w:rPr>
+          <w:rStyle w:val="VerbatimChar"/>
+        </w:rPr>
+        <w:t xml:space="preserve">ACRME-T200303</w:t>
+      </w:r>
+      <w:r>
+        <w:t xml:space="preserve"> </w:t>
+      </w:r>
+      <w:r>
+        <w:t xml:space="preserve">Wire deterministic CRG naming (OPS-006/C-12)</w:t>
+      </w:r>
+    </w:p>
+    <w:bookmarkEnd w:id="113"/>
+    <w:bookmarkStart w:id="114" w:name="Xa6c2007ee57c171a1b676946b64c74c564c62b5"/>
+    <w:p>
+      <w:pPr>
+        <w:pStyle w:val="Heading4"/>
+      </w:pPr>
+      <w:r>
+        <w:t xml:space="preserve">ACRME-S2004 — Reactive SKU/AZ discovery auto-create with scope-file governance</w:t>
+      </w:r>
+    </w:p>
+    <w:p>
+      <w:pPr>
+        <w:pStyle w:val="BlockText"/>
+      </w:pPr>
+      <w:r>
+        <w:rPr>
+          <w:bCs/>
+          <w:b/>
+        </w:rPr>
+        <w:t xml:space="preserve">As a</w:t>
+      </w:r>
+      <w:r>
+        <w:t xml:space="preserve"> </w:t>
+      </w:r>
+      <w:r>
+        <w:t xml:space="preserve">capacity engineer,</w:t>
+      </w:r>
+      <w:r>
+        <w:t xml:space="preserve"> </w:t>
+      </w:r>
+      <w:r>
+        <w:rPr>
+          <w:bCs/>
+          <w:b/>
+        </w:rPr>
+        <w:t xml:space="preserve">I want</w:t>
+      </w:r>
+      <w:r>
+        <w:t xml:space="preserve"> </w:t>
+      </w:r>
+      <w:r>
+        <w:t xml:space="preserve">the engine to auto-create missing SKU/AZ reservations against the seed matrix and raise a scope-file governance item,</w:t>
+      </w:r>
+      <w:r>
+        <w:t xml:space="preserve"> </w:t>
+      </w:r>
+      <w:r>
+        <w:rPr>
+          <w:bCs/>
+          <w:b/>
+        </w:rPr>
+        <w:t xml:space="preserve">so that</w:t>
+      </w:r>
+      <w:r>
+        <w:t xml:space="preserve"> </w:t>
+      </w:r>
+      <w:r>
+        <w:t xml:space="preserve">newly requested SKU/AZ combinations are captured and governed, reconciling CAP-019 (CAP-024).</w:t>
+      </w:r>
+    </w:p>
+    <w:p>
+      <w:pPr>
+        <w:numPr>
+          <w:ilvl w:val="0"/>
+          <w:numId w:val="1209"/>
+        </w:numPr>
+        <w:pStyle w:val="Compact"/>
+      </w:pPr>
+      <w:r>
+        <w:rPr>
+          <w:bCs/>
+          <w:b/>
+        </w:rPr>
+        <w:t xml:space="preserve">Priority:</w:t>
+      </w:r>
+      <w:r>
+        <w:t xml:space="preserve"> </w:t>
+      </w:r>
+      <w:r>
+        <w:t xml:space="preserve">High ·</w:t>
+      </w:r>
+      <w:r>
+        <w:t xml:space="preserve"> </w:t>
+      </w:r>
+      <w:r>
+        <w:rPr>
+          <w:bCs/>
+          <w:b/>
+        </w:rPr>
+        <w:t xml:space="preserve">Points:</w:t>
+      </w:r>
+      <w:r>
+        <w:t xml:space="preserve"> </w:t>
+      </w:r>
+      <w:r>
+        <w:t xml:space="preserve">5 ·</w:t>
+      </w:r>
+      <w:r>
+        <w:t xml:space="preserve"> </w:t>
+      </w:r>
+      <w:r>
+        <w:rPr>
+          <w:bCs/>
+          <w:b/>
+        </w:rPr>
+        <w:t xml:space="preserve">Phase:</w:t>
+      </w:r>
+      <w:r>
+        <w:t xml:space="preserve"> </w:t>
+      </w:r>
+      <w:r>
+        <w:t xml:space="preserve">P2</w:t>
+      </w:r>
+    </w:p>
+    <w:p>
+      <w:pPr>
+        <w:numPr>
+          <w:ilvl w:val="0"/>
+          <w:numId w:val="1209"/>
+        </w:numPr>
+        <w:pStyle w:val="Compact"/>
+      </w:pPr>
+      <w:r>
+        <w:rPr>
+          <w:bCs/>
+          <w:b/>
+        </w:rPr>
+        <w:t xml:space="preserve">PRR refs:</w:t>
+      </w:r>
+      <w:r>
+        <w:t xml:space="preserve"> </w:t>
+      </w:r>
+      <w:r>
+        <w:t xml:space="preserve">CAP-024, CAP-019, CAP-022</w:t>
+      </w:r>
+    </w:p>
+    <w:p>
+      <w:pPr>
+        <w:numPr>
+          <w:ilvl w:val="0"/>
+          <w:numId w:val="1209"/>
+        </w:numPr>
+        <w:pStyle w:val="Compact"/>
+      </w:pPr>
+      <w:r>
+        <w:rPr>
+          <w:bCs/>
+          <w:b/>
+        </w:rPr>
+        <w:t xml:space="preserve">Depends on:</w:t>
+      </w:r>
+      <w:r>
+        <w:t xml:space="preserve"> </w:t>
+      </w:r>
+      <w:r>
+        <w:t xml:space="preserve">ACRME-S2002, ACRME-S2003</w:t>
+      </w:r>
+    </w:p>
+    <w:p>
+      <w:pPr>
+        <w:pStyle w:val="FirstParagraph"/>
+      </w:pPr>
+      <w:r>
+        <w:rPr>
+          <w:bCs/>
+          <w:b/>
+        </w:rPr>
+        <w:t xml:space="preserve">Acceptance criteria</w:t>
+      </w:r>
+    </w:p>
+    <w:p>
+      <w:pPr>
+        <w:numPr>
+          <w:ilvl w:val="0"/>
+          <w:numId w:val="1210"/>
+        </w:numPr>
+        <w:pStyle w:val="Compact"/>
+      </w:pPr>
+      <w:r>
+        <w:t xml:space="preserve">A request for a SKU/AZ combination not yet in a CRG triggers auto-creation of the reservation against the seed matrix.</w:t>
+      </w:r>
+    </w:p>
+    <w:p>
+      <w:pPr>
+        <w:numPr>
+          <w:ilvl w:val="0"/>
+          <w:numId w:val="1210"/>
+        </w:numPr>
+        <w:pStyle w:val="Compact"/>
+      </w:pPr>
+      <w:r>
+        <w:t xml:space="preserve">Each reactive discovery raises a scope-file governance item for review (reconciles CAP-019).</w:t>
+      </w:r>
+    </w:p>
+    <w:p>
+      <w:pPr>
+        <w:numPr>
+          <w:ilvl w:val="0"/>
+          <w:numId w:val="1210"/>
+        </w:numPr>
+        <w:pStyle w:val="Compact"/>
+      </w:pPr>
+      <w:r>
+        <w:t xml:space="preserve">Auto-created reservations are recorded with provenance (reactive vs. seeded vs. planned).</w:t>
+      </w:r>
+    </w:p>
+    <w:p>
+      <w:pPr>
+        <w:numPr>
+          <w:ilvl w:val="0"/>
+          <w:numId w:val="1210"/>
+        </w:numPr>
+        <w:pStyle w:val="Compact"/>
+      </w:pPr>
+      <w:r>
+        <w:t xml:space="preserve">Reactive discovery respects reservation eligibility (CAP-020/CAP-021).</w:t>
+      </w:r>
+    </w:p>
+    <w:p>
+      <w:pPr>
+        <w:pStyle w:val="FirstParagraph"/>
+      </w:pPr>
+      <w:r>
+        <w:rPr>
+          <w:bCs/>
+          <w:b/>
+        </w:rPr>
+        <w:t xml:space="preserve">Tasks</w:t>
+      </w:r>
+    </w:p>
+    <w:p>
+      <w:pPr>
+        <w:numPr>
+          <w:ilvl w:val="0"/>
+          <w:numId w:val="1211"/>
+        </w:numPr>
+        <w:pStyle w:val="Compact"/>
+      </w:pPr>
+      <w:r>
+        <w:t xml:space="preserve">☐</w:t>
+      </w:r>
+      <w:r>
+        <w:t xml:space="preserve"> </w:t>
+      </w:r>
+      <w:r>
+        <w:rPr>
+          <w:rStyle w:val="VerbatimChar"/>
+        </w:rPr>
+        <w:t xml:space="preserve">ACRME-T200401</w:t>
+      </w:r>
+      <w:r>
+        <w:t xml:space="preserve"> </w:t>
+      </w:r>
+      <w:r>
+        <w:t xml:space="preserve">Implement reactive SKU/AZ discovery + auto-create against seed matrix (CAP-024)</w:t>
+      </w:r>
+    </w:p>
+    <w:p>
+      <w:pPr>
+        <w:numPr>
+          <w:ilvl w:val="0"/>
+          <w:numId w:val="1211"/>
+        </w:numPr>
+        <w:pStyle w:val="Compact"/>
+      </w:pPr>
+      <w:r>
+        <w:t xml:space="preserve">☐</w:t>
+      </w:r>
+      <w:r>
+        <w:t xml:space="preserve"> </w:t>
+      </w:r>
+      <w:r>
+        <w:rPr>
+          <w:rStyle w:val="VerbatimChar"/>
+        </w:rPr>
+        <w:t xml:space="preserve">ACRME-T200402</w:t>
+      </w:r>
+      <w:r>
+        <w:t xml:space="preserve"> </w:t>
+      </w:r>
+      <w:r>
+        <w:t xml:space="preserve">Raise scope-file governance item on reactive discovery (CAP-019 reconciliation)</w:t>
+      </w:r>
+    </w:p>
+    <w:p>
+      <w:pPr>
+        <w:numPr>
+          <w:ilvl w:val="0"/>
+          <w:numId w:val="1211"/>
+        </w:numPr>
+        <w:pStyle w:val="Compact"/>
+      </w:pPr>
+      <w:r>
+        <w:t xml:space="preserve">☐</w:t>
+      </w:r>
+      <w:r>
+        <w:t xml:space="preserve"> </w:t>
+      </w:r>
+      <w:r>
+        <w:rPr>
+          <w:rStyle w:val="VerbatimChar"/>
+        </w:rPr>
+        <w:t xml:space="preserve">ACRME-T200403</w:t>
+      </w:r>
+      <w:r>
+        <w:t xml:space="preserve"> </w:t>
+      </w:r>
+      <w:r>
+        <w:t xml:space="preserve">Record reservation provenance (reactive/seeded/planned)</w:t>
+      </w:r>
+    </w:p>
+    <w:bookmarkEnd w:id="114"/>
+    <w:bookmarkStart w:id="115" w:name="X219c0529456b832ff20bbda48b072f41a6497c9"/>
+    <w:p>
+      <w:pPr>
+        <w:pStyle w:val="Heading4"/>
+      </w:pPr>
+      <w:r>
+        <w:t xml:space="preserve">ACRME-S2005 — Even zone-distribution target and rebalancing action</w:t>
+      </w:r>
+    </w:p>
+    <w:p>
+      <w:pPr>
+        <w:pStyle w:val="BlockText"/>
+      </w:pPr>
+      <w:r>
+        <w:rPr>
+          <w:bCs/>
+          <w:b/>
+        </w:rPr>
+        <w:t xml:space="preserve">As a</w:t>
+      </w:r>
+      <w:r>
+        <w:t xml:space="preserve"> </w:t>
+      </w:r>
+      <w:r>
+        <w:t xml:space="preserve">placement engineer,</w:t>
+      </w:r>
+      <w:r>
+        <w:t xml:space="preserve"> </w:t>
+      </w:r>
+      <w:r>
+        <w:rPr>
+          <w:bCs/>
+          <w:b/>
+        </w:rPr>
+        <w:t xml:space="preserve">I want</w:t>
+      </w:r>
+      <w:r>
+        <w:t xml:space="preserve"> </w:t>
+      </w:r>
+      <w:r>
+        <w:t xml:space="preserve">placement to target an even ≈1/zone_count spread and raise a rebalancing action when skew exceeds tolerance,</w:t>
+      </w:r>
+      <w:r>
+        <w:t xml:space="preserve"> </w:t>
+      </w:r>
+      <w:r>
+        <w:rPr>
+          <w:bCs/>
+          <w:b/>
+        </w:rPr>
+        <w:t xml:space="preserve">so that</w:t>
+      </w:r>
+      <w:r>
+        <w:t xml:space="preserve"> </w:t>
+      </w:r>
+      <w:r>
+        <w:t xml:space="preserve">per-zone failover exposure is bounded and per-AZ CRG sizing stays balanced (PLC-011).</w:t>
+      </w:r>
+    </w:p>
+    <w:p>
+      <w:pPr>
+        <w:numPr>
+          <w:ilvl w:val="0"/>
+          <w:numId w:val="1212"/>
+        </w:numPr>
+        <w:pStyle w:val="Compact"/>
+      </w:pPr>
+      <w:r>
+        <w:rPr>
+          <w:bCs/>
+          <w:b/>
+        </w:rPr>
+        <w:t xml:space="preserve">Priority:</w:t>
+      </w:r>
+      <w:r>
+        <w:t xml:space="preserve"> </w:t>
+      </w:r>
+      <w:r>
+        <w:t xml:space="preserve">High ·</w:t>
+      </w:r>
+      <w:r>
+        <w:t xml:space="preserve"> </w:t>
+      </w:r>
+      <w:r>
+        <w:rPr>
+          <w:bCs/>
+          <w:b/>
+        </w:rPr>
+        <w:t xml:space="preserve">Points:</w:t>
+      </w:r>
+      <w:r>
+        <w:t xml:space="preserve"> </w:t>
+      </w:r>
+      <w:r>
+        <w:t xml:space="preserve">5 ·</w:t>
+      </w:r>
+      <w:r>
+        <w:t xml:space="preserve"> </w:t>
+      </w:r>
+      <w:r>
+        <w:rPr>
+          <w:bCs/>
+          <w:b/>
+        </w:rPr>
+        <w:t xml:space="preserve">Phase:</w:t>
+      </w:r>
+      <w:r>
+        <w:t xml:space="preserve"> </w:t>
+      </w:r>
+      <w:r>
+        <w:t xml:space="preserve">P2</w:t>
+      </w:r>
+    </w:p>
+    <w:p>
+      <w:pPr>
+        <w:numPr>
+          <w:ilvl w:val="0"/>
+          <w:numId w:val="1212"/>
+        </w:numPr>
+        <w:pStyle w:val="Compact"/>
+      </w:pPr>
+      <w:r>
+        <w:rPr>
+          <w:bCs/>
+          <w:b/>
+        </w:rPr>
+        <w:t xml:space="preserve">PRR refs:</w:t>
+      </w:r>
+      <w:r>
+        <w:t xml:space="preserve"> </w:t>
+      </w:r>
+      <w:r>
+        <w:t xml:space="preserve">PLC-011, C-13, Appendix A.9, CAP-023</w:t>
+      </w:r>
+    </w:p>
+    <w:p>
+      <w:pPr>
+        <w:numPr>
+          <w:ilvl w:val="0"/>
+          <w:numId w:val="1212"/>
+        </w:numPr>
+        <w:pStyle w:val="Compact"/>
+      </w:pPr>
+      <w:r>
+        <w:rPr>
+          <w:bCs/>
+          <w:b/>
+        </w:rPr>
+        <w:t xml:space="preserve">Depends on:</w:t>
+      </w:r>
+      <w:r>
+        <w:t xml:space="preserve"> </w:t>
+      </w:r>
+      <w:r>
+        <w:t xml:space="preserve">ACRME-S2003, ACRME-S0701</w:t>
+      </w:r>
+    </w:p>
+    <w:p>
+      <w:pPr>
+        <w:pStyle w:val="FirstParagraph"/>
+      </w:pPr>
+      <w:r>
+        <w:rPr>
+          <w:bCs/>
+          <w:b/>
+        </w:rPr>
+        <w:t xml:space="preserve">Acceptance criteria</w:t>
+      </w:r>
+    </w:p>
+    <w:p>
+      <w:pPr>
+        <w:numPr>
+          <w:ilvl w:val="0"/>
+          <w:numId w:val="1213"/>
+        </w:numPr>
+        <w:pStyle w:val="Compact"/>
+      </w:pPr>
+      <w:r>
+        <w:t xml:space="preserve">New placement prefers the most under-represented zone (</w:t>
+      </w:r>
+      <w:r>
+        <w:rPr>
+          <w:rStyle w:val="VerbatimChar"/>
+        </w:rPr>
+        <w:t xml:space="preserve">argmin</w:t>
+      </w:r>
+      <w:r>
+        <w:t xml:space="preserve"> </w:t>
+      </w:r>
+      <w:r>
+        <w:t xml:space="preserve">VMs per zone) toward ≈</w:t>
+      </w:r>
+      <w:r>
+        <w:rPr>
+          <w:rStyle w:val="VerbatimChar"/>
+        </w:rPr>
+        <w:t xml:space="preserve">1/zone_count</w:t>
+      </w:r>
+      <w:r>
+        <w:t xml:space="preserve"> </w:t>
+      </w:r>
+      <w:r>
+        <w:t xml:space="preserve">per zone.</w:t>
+      </w:r>
+    </w:p>
+    <w:p>
+      <w:pPr>
+        <w:numPr>
+          <w:ilvl w:val="0"/>
+          <w:numId w:val="1213"/>
+        </w:numPr>
+        <w:pStyle w:val="Compact"/>
+      </w:pPr>
+      <w:r>
+        <w:rPr>
+          <w:rStyle w:val="VerbatimChar"/>
+        </w:rPr>
+        <w:t xml:space="preserve">Max Skew &gt; Configured Skew Tolerance</w:t>
+      </w:r>
+      <w:r>
+        <w:t xml:space="preserve"> </w:t>
+      </w:r>
+      <w:r>
+        <w:t xml:space="preserve">(C-13) raises a rebalancing recommendation/action, subject to approval and Azure feasibility.</w:t>
+      </w:r>
+    </w:p>
+    <w:p>
+      <w:pPr>
+        <w:numPr>
+          <w:ilvl w:val="0"/>
+          <w:numId w:val="1213"/>
+        </w:numPr>
+        <w:pStyle w:val="Compact"/>
+      </w:pPr>
+      <w:r>
+        <w:t xml:space="preserve">The target ratio and tolerance are configuration-driven in</w:t>
+      </w:r>
+      <w:r>
+        <w:t xml:space="preserve"> </w:t>
+      </w:r>
+      <w:r>
+        <w:rPr>
+          <w:rStyle w:val="VerbatimChar"/>
+        </w:rPr>
+        <w:t xml:space="preserve">PlacementPolicy</w:t>
+      </w:r>
+      <w:r>
+        <w:t xml:space="preserve">.</w:t>
+      </w:r>
+    </w:p>
+    <w:p>
+      <w:pPr>
+        <w:numPr>
+          <w:ilvl w:val="0"/>
+          <w:numId w:val="1213"/>
+        </w:numPr>
+        <w:pStyle w:val="Compact"/>
+      </w:pPr>
+      <w:r>
+        <w:t xml:space="preserve">Behaviour matches Appendix A.9 skew formula and is distinct from the ε zone-diversity scoring signal (PLC-007).</w:t>
+      </w:r>
+    </w:p>
+    <w:p>
+      <w:pPr>
+        <w:pStyle w:val="FirstParagraph"/>
+      </w:pPr>
+      <w:r>
+        <w:rPr>
+          <w:bCs/>
+          <w:b/>
+        </w:rPr>
+        <w:t xml:space="preserve">Tasks</w:t>
+      </w:r>
+    </w:p>
+    <w:p>
+      <w:pPr>
+        <w:numPr>
+          <w:ilvl w:val="0"/>
+          <w:numId w:val="1214"/>
+        </w:numPr>
+        <w:pStyle w:val="Compact"/>
+      </w:pPr>
+      <w:r>
+        <w:t xml:space="preserve">☐</w:t>
+      </w:r>
+      <w:r>
+        <w:t xml:space="preserve"> </w:t>
+      </w:r>
+      <w:r>
+        <w:rPr>
+          <w:rStyle w:val="VerbatimChar"/>
+        </w:rPr>
+        <w:t xml:space="preserve">ACRME-T200501</w:t>
+      </w:r>
+      <w:r>
+        <w:t xml:space="preserve"> </w:t>
+      </w:r>
+      <w:r>
+        <w:t xml:space="preserve">Implement even zone-distribution target + under-represented-zone preference (PLC-011/A.9)</w:t>
+      </w:r>
+    </w:p>
+    <w:p>
+      <w:pPr>
+        <w:numPr>
+          <w:ilvl w:val="0"/>
+          <w:numId w:val="1214"/>
+        </w:numPr>
+        <w:pStyle w:val="Compact"/>
+      </w:pPr>
+      <w:r>
+        <w:t xml:space="preserve">☐</w:t>
+      </w:r>
+      <w:r>
+        <w:t xml:space="preserve"> </w:t>
+      </w:r>
+      <w:r>
+        <w:rPr>
+          <w:rStyle w:val="VerbatimChar"/>
+        </w:rPr>
+        <w:t xml:space="preserve">ACRME-T200502</w:t>
+      </w:r>
+      <w:r>
+        <w:t xml:space="preserve"> </w:t>
+      </w:r>
+      <w:r>
+        <w:t xml:space="preserve">Implement skew-tolerance (C-13) rebalancing recommendation/action</w:t>
+      </w:r>
+    </w:p>
+    <w:p>
+      <w:pPr>
+        <w:numPr>
+          <w:ilvl w:val="0"/>
+          <w:numId w:val="1214"/>
+        </w:numPr>
+        <w:pStyle w:val="Compact"/>
+      </w:pPr>
+      <w:r>
+        <w:t xml:space="preserve">☐</w:t>
+      </w:r>
+      <w:r>
+        <w:t xml:space="preserve"> </w:t>
+      </w:r>
+      <w:r>
+        <w:rPr>
+          <w:rStyle w:val="VerbatimChar"/>
+        </w:rPr>
+        <w:t xml:space="preserve">ACRME-T200503</w:t>
+      </w:r>
+      <w:r>
+        <w:t xml:space="preserve"> </w:t>
+      </w:r>
+      <w:r>
+        <w:t xml:space="preserve">Expose target ratio + tolerance as PlacementPolicy config</w:t>
+      </w:r>
+    </w:p>
+    <w:bookmarkEnd w:id="115"/>
+    <w:bookmarkStart w:id="116" w:name="X9e57d0f681ad63f791ab9a507e84c13f9981e47"/>
+    <w:p>
+      <w:pPr>
+        <w:pStyle w:val="Heading4"/>
+      </w:pPr>
+      <w:r>
+        <w:t xml:space="preserve">ACRME-S2006 — Deterministic RG/CRG/subscription naming convention &amp; counter</w:t>
+      </w:r>
+    </w:p>
+    <w:p>
+      <w:pPr>
+        <w:pStyle w:val="BlockText"/>
+      </w:pPr>
+      <w:r>
+        <w:rPr>
+          <w:bCs/>
+          <w:b/>
+        </w:rPr>
+        <w:t xml:space="preserve">As a</w:t>
+      </w:r>
+      <w:r>
+        <w:t xml:space="preserve"> </w:t>
+      </w:r>
+      <w:r>
+        <w:t xml:space="preserve">platform operator,</w:t>
+      </w:r>
+      <w:r>
+        <w:t xml:space="preserve"> </w:t>
+      </w:r>
+      <w:r>
+        <w:rPr>
+          <w:bCs/>
+          <w:b/>
+        </w:rPr>
+        <w:t xml:space="preserve">I want</w:t>
+      </w:r>
+      <w:r>
+        <w:t xml:space="preserve"> </w:t>
+      </w:r>
+      <w:r>
+        <w:t xml:space="preserve">a deterministic naming convention with a counter for resource groups, CRGs, and subscriptions,</w:t>
+      </w:r>
+      <w:r>
+        <w:t xml:space="preserve"> </w:t>
+      </w:r>
+      <w:r>
+        <w:rPr>
+          <w:bCs/>
+          <w:b/>
+        </w:rPr>
+        <w:t xml:space="preserve">so that</w:t>
+      </w:r>
+      <w:r>
+        <w:t xml:space="preserve"> </w:t>
+      </w:r>
+      <w:r>
+        <w:t xml:space="preserve">resource identities are predictable, collision-free, and auditable (OPS-006, C-12).</w:t>
+      </w:r>
+    </w:p>
+    <w:p>
+      <w:pPr>
+        <w:numPr>
+          <w:ilvl w:val="0"/>
+          <w:numId w:val="1215"/>
+        </w:numPr>
+        <w:pStyle w:val="Compact"/>
+      </w:pPr>
+      <w:r>
+        <w:rPr>
+          <w:bCs/>
+          <w:b/>
+        </w:rPr>
+        <w:t xml:space="preserve">Priority:</w:t>
+      </w:r>
+      <w:r>
+        <w:t xml:space="preserve"> </w:t>
+      </w:r>
+      <w:r>
+        <w:t xml:space="preserve">Medium ·</w:t>
+      </w:r>
+      <w:r>
+        <w:t xml:space="preserve"> </w:t>
+      </w:r>
+      <w:r>
+        <w:rPr>
+          <w:bCs/>
+          <w:b/>
+        </w:rPr>
+        <w:t xml:space="preserve">Points:</w:t>
+      </w:r>
+      <w:r>
+        <w:t xml:space="preserve"> </w:t>
+      </w:r>
+      <w:r>
+        <w:t xml:space="preserve">3 ·</w:t>
+      </w:r>
+      <w:r>
+        <w:t xml:space="preserve"> </w:t>
+      </w:r>
+      <w:r>
+        <w:rPr>
+          <w:bCs/>
+          <w:b/>
+        </w:rPr>
+        <w:t xml:space="preserve">Phase:</w:t>
+      </w:r>
+      <w:r>
+        <w:t xml:space="preserve"> </w:t>
+      </w:r>
+      <w:r>
+        <w:t xml:space="preserve">P1</w:t>
+      </w:r>
+    </w:p>
+    <w:p>
+      <w:pPr>
+        <w:numPr>
+          <w:ilvl w:val="0"/>
+          <w:numId w:val="1215"/>
+        </w:numPr>
+        <w:pStyle w:val="Compact"/>
+      </w:pPr>
+      <w:r>
+        <w:rPr>
+          <w:bCs/>
+          <w:b/>
+        </w:rPr>
+        <w:t xml:space="preserve">PRR refs:</w:t>
+      </w:r>
+      <w:r>
+        <w:t xml:space="preserve"> </w:t>
+      </w:r>
+      <w:r>
+        <w:t xml:space="preserve">OPS-006, C-12</w:t>
+      </w:r>
+    </w:p>
+    <w:p>
+      <w:pPr>
+        <w:numPr>
+          <w:ilvl w:val="0"/>
+          <w:numId w:val="1215"/>
+        </w:numPr>
+        <w:pStyle w:val="Compact"/>
+      </w:pPr>
+      <w:r>
+        <w:rPr>
+          <w:bCs/>
+          <w:b/>
+        </w:rPr>
+        <w:t xml:space="preserve">Depends on:</w:t>
+      </w:r>
+      <w:r>
+        <w:t xml:space="preserve"> </w:t>
+      </w:r>
+      <w:r>
+        <w:t xml:space="preserve">—</w:t>
+      </w:r>
+    </w:p>
+    <w:p>
+      <w:pPr>
+        <w:pStyle w:val="FirstParagraph"/>
+      </w:pPr>
+      <w:r>
+        <w:rPr>
+          <w:bCs/>
+          <w:b/>
+        </w:rPr>
+        <w:t xml:space="preserve">Acceptance criteria</w:t>
+      </w:r>
+    </w:p>
+    <w:p>
+      <w:pPr>
+        <w:numPr>
+          <w:ilvl w:val="0"/>
+          <w:numId w:val="1216"/>
+        </w:numPr>
+        <w:pStyle w:val="Compact"/>
+      </w:pPr>
+      <w:r>
+        <w:t xml:space="preserve">RG, CRG, and subscription names are generated by a single deterministic convention (OPS-006).</w:t>
+      </w:r>
+    </w:p>
+    <w:p>
+      <w:pPr>
+        <w:numPr>
+          <w:ilvl w:val="0"/>
+          <w:numId w:val="1216"/>
+        </w:numPr>
+        <w:pStyle w:val="Compact"/>
+      </w:pPr>
+      <w:r>
+        <w:t xml:space="preserve">The naming counter (C-12) guarantees uniqueness and is persisted/auditable.</w:t>
+      </w:r>
+    </w:p>
+    <w:p>
+      <w:pPr>
+        <w:numPr>
+          <w:ilvl w:val="0"/>
+          <w:numId w:val="1216"/>
+        </w:numPr>
+        <w:pStyle w:val="Compact"/>
+      </w:pPr>
+      <w:r>
+        <w:t xml:space="preserve">Generated names are stable across re-runs for the same inputs.</w:t>
+      </w:r>
+    </w:p>
+    <w:p>
+      <w:pPr>
+        <w:numPr>
+          <w:ilvl w:val="0"/>
+          <w:numId w:val="1216"/>
+        </w:numPr>
+        <w:pStyle w:val="Compact"/>
+      </w:pPr>
+      <w:r>
+        <w:t xml:space="preserve">RBAC scope assignments consume the deterministic names (no ad-hoc naming).</w:t>
+      </w:r>
+    </w:p>
+    <w:p>
+      <w:pPr>
+        <w:pStyle w:val="FirstParagraph"/>
+      </w:pPr>
+      <w:r>
+        <w:rPr>
+          <w:bCs/>
+          <w:b/>
+        </w:rPr>
+        <w:t xml:space="preserve">Tasks</w:t>
+      </w:r>
+    </w:p>
+    <w:p>
+      <w:pPr>
+        <w:numPr>
+          <w:ilvl w:val="0"/>
+          <w:numId w:val="1217"/>
+        </w:numPr>
+        <w:pStyle w:val="Compact"/>
+      </w:pPr>
+      <w:r>
+        <w:t xml:space="preserve">☐</w:t>
+      </w:r>
+      <w:r>
+        <w:t xml:space="preserve"> </w:t>
+      </w:r>
+      <w:r>
+        <w:rPr>
+          <w:rStyle w:val="VerbatimChar"/>
+        </w:rPr>
+        <w:t xml:space="preserve">ACRME-T200601</w:t>
+      </w:r>
+      <w:r>
+        <w:t xml:space="preserve"> </w:t>
+      </w:r>
+      <w:r>
+        <w:t xml:space="preserve">Implement deterministic RG/CRG/subscription naming convention (OPS-006)</w:t>
+      </w:r>
+    </w:p>
+    <w:p>
+      <w:pPr>
+        <w:numPr>
+          <w:ilvl w:val="0"/>
+          <w:numId w:val="1217"/>
+        </w:numPr>
+        <w:pStyle w:val="Compact"/>
+      </w:pPr>
+      <w:r>
+        <w:t xml:space="preserve">☐</w:t>
+      </w:r>
+      <w:r>
+        <w:t xml:space="preserve"> </w:t>
+      </w:r>
+      <w:r>
+        <w:rPr>
+          <w:rStyle w:val="VerbatimChar"/>
+        </w:rPr>
+        <w:t xml:space="preserve">ACRME-T200602</w:t>
+      </w:r>
+      <w:r>
+        <w:t xml:space="preserve"> </w:t>
+      </w:r>
+      <w:r>
+        <w:t xml:space="preserve">Implement + persist the naming counter (C-12)</w:t>
+      </w:r>
+    </w:p>
+    <w:p>
+      <w:pPr>
+        <w:numPr>
+          <w:ilvl w:val="0"/>
+          <w:numId w:val="1217"/>
+        </w:numPr>
+        <w:pStyle w:val="Compact"/>
+      </w:pPr>
+      <w:r>
+        <w:t xml:space="preserve">☐</w:t>
+      </w:r>
+      <w:r>
+        <w:t xml:space="preserve"> </w:t>
+      </w:r>
+      <w:r>
+        <w:rPr>
+          <w:rStyle w:val="VerbatimChar"/>
+        </w:rPr>
+        <w:t xml:space="preserve">ACRME-T200603</w:t>
+      </w:r>
+      <w:r>
+        <w:t xml:space="preserve"> </w:t>
+      </w:r>
+      <w:r>
+        <w:t xml:space="preserve">Align RBAC scope assignment with deterministic names</w:t>
+      </w:r>
+    </w:p>
+    <w:bookmarkEnd w:id="116"/>
+    <w:bookmarkEnd w:id="117"/>
+    <w:bookmarkEnd w:id="118"/>
+    <w:bookmarkEnd w:id="119"/>
     <w:sectPr/>
   </w:body>
 </w:document>
@@ -29224,6 +31897,60 @@
     <w:abstractNumId w:val="991"/>
   </w:num>
   <w:num w:numId="1199">
+    <w:abstractNumId w:val="991"/>
+  </w:num>
+  <w:num w:numId="1200">
+    <w:abstractNumId w:val="991"/>
+  </w:num>
+  <w:num w:numId="1201">
+    <w:abstractNumId w:val="991"/>
+  </w:num>
+  <w:num w:numId="1202">
+    <w:abstractNumId w:val="991"/>
+  </w:num>
+  <w:num w:numId="1203">
+    <w:abstractNumId w:val="991"/>
+  </w:num>
+  <w:num w:numId="1204">
+    <w:abstractNumId w:val="991"/>
+  </w:num>
+  <w:num w:numId="1205">
+    <w:abstractNumId w:val="991"/>
+  </w:num>
+  <w:num w:numId="1206">
+    <w:abstractNumId w:val="991"/>
+  </w:num>
+  <w:num w:numId="1207">
+    <w:abstractNumId w:val="991"/>
+  </w:num>
+  <w:num w:numId="1208">
+    <w:abstractNumId w:val="991"/>
+  </w:num>
+  <w:num w:numId="1209">
+    <w:abstractNumId w:val="991"/>
+  </w:num>
+  <w:num w:numId="1210">
+    <w:abstractNumId w:val="991"/>
+  </w:num>
+  <w:num w:numId="1211">
+    <w:abstractNumId w:val="991"/>
+  </w:num>
+  <w:num w:numId="1212">
+    <w:abstractNumId w:val="991"/>
+  </w:num>
+  <w:num w:numId="1213">
+    <w:abstractNumId w:val="991"/>
+  </w:num>
+  <w:num w:numId="1214">
+    <w:abstractNumId w:val="991"/>
+  </w:num>
+  <w:num w:numId="1215">
+    <w:abstractNumId w:val="991"/>
+  </w:num>
+  <w:num w:numId="1216">
+    <w:abstractNumId w:val="991"/>
+  </w:num>
+  <w:num w:numId="1217">
     <w:abstractNumId w:val="991"/>
   </w:num>
 </w:numbering>

</xml_diff>